<commit_message>
docs: alinear fila README en informe P3
Made-with: Cursor
</commit_message>
<xml_diff>
--- a/proyecto_3/INFORME_PROYECTO_3_COMPLETO.docx
+++ b/proyecto_3/INFORME_PROYECTO_3_COMPLETO.docx
@@ -1363,68 +1363,22 @@
               <w:pStyle w:val="Compact"/>
             </w:pPr>
             <w:r>
-              <w:t xml:space="preserve">Instalación, ejecución (puerto</w:t>
+              <w:t xml:space="preserve">Vista mínima en GitHub; detalle en</w:t>
             </w:r>
             <w:r>
               <w:t xml:space="preserve"> </w:t>
             </w:r>
             <w:r>
               <w:rPr>
-                <w:b/>
-                <w:bCs/>
-              </w:rPr>
-              <w:t xml:space="preserve">5174</w:t>
-            </w:r>
-            <w:r>
-              <w:t xml:space="preserve">), rutas</w:t>
+                <w:rStyle w:val="VerbatimChar"/>
+              </w:rPr>
+              <w:t xml:space="preserve">docs/README_DOCUMENTACION.md</w:t>
             </w:r>
             <w:r>
               <w:t xml:space="preserve"> </w:t>
             </w:r>
             <w:r>
-              <w:rPr>
-                <w:rStyle w:val="VerbatimChar"/>
-              </w:rPr>
-              <w:t xml:space="preserve">/login</w:t>
-            </w:r>
-            <w:r>
-              <w:t xml:space="preserve">,</w:t>
-            </w:r>
-            <w:r>
-              <w:t xml:space="preserve"> </w:t>
-            </w:r>
-            <w:r>
-              <w:rPr>
-                <w:rStyle w:val="VerbatimChar"/>
-              </w:rPr>
-              <w:t xml:space="preserve">/registro</w:t>
-            </w:r>
-            <w:r>
-              <w:t xml:space="preserve">,</w:t>
-            </w:r>
-            <w:r>
-              <w:t xml:space="preserve"> </w:t>
-            </w:r>
-            <w:r>
-              <w:rPr>
-                <w:rStyle w:val="VerbatimChar"/>
-              </w:rPr>
-              <w:t xml:space="preserve">/favoritos</w:t>
-            </w:r>
-            <w:r>
-              <w:t xml:space="preserve">,</w:t>
-            </w:r>
-            <w:r>
-              <w:t xml:space="preserve"> </w:t>
-            </w:r>
-            <w:r>
-              <w:rPr>
-                <w:rStyle w:val="VerbatimChar"/>
-              </w:rPr>
-              <w:t xml:space="preserve">/preferencias-clima</w:t>
-            </w:r>
-            <w:r>
-              <w:t xml:space="preserve">, credenciales demo, despliegue Netlify.</w:t>
+              <w:t xml:space="preserve">(rutas, credenciales, Netlify, etc.).</w:t>
             </w:r>
           </w:p>
         </w:tc>

</xml_diff>